<commit_message>
docs: publish DDS-8555 assignment 5 deliverables
</commit_message>
<xml_diff>
--- a/Week 5/Assignment 5/MaldonadoJDDS8555-5.docx
+++ b/Week 5/Assignment 5/MaldonadoJDDS8555-5.docx
@@ -86,7 +86,7 @@
           <w:b w:val="0"/>
           <w:i w:val="0"/>
         </w:rPr>
-        <w:t>June 07, 2026</w:t>
+        <w:t>June 11, 2026</w:t>
       </w:r>
     </w:p>
     <w:p>
@@ -188,7 +188,7 @@
           <w:b w:val="0"/>
           <w:i w:val="0"/>
         </w:rPr>
-        <w:t>The first Obesity submission used multinomial logistic regression.  This is the regularized linear baseline, and its public/private Kaggle scores were 0.86632/0.86497.  The model is useful because it gives a direct comparison point for the more flexible classifiers while still controlling coefficient instability through regularization.</w:t>
+        <w:t>The first Obesity submission used multinomial logistic regression.  This is the regularized linear baseline, and its fresh public/private Kaggle scores were 0.86632/0.86596.  The notebook now reports a C-comparison table, so the regularization strength is visible rather than only implied by the software default.</w:t>
       </w:r>
     </w:p>
     <w:p>
@@ -253,7 +253,7 @@
           <w:b/>
           <w:i w:val="0"/>
         </w:rPr>
-        <w:t>Kaggle Model 4: SVM</w:t>
+        <w:t>Kaggle Model 4: RBF SVM</w:t>
       </w:r>
     </w:p>
     <w:p>
@@ -266,7 +266,7 @@
           <w:b w:val="0"/>
           <w:i w:val="0"/>
         </w:rPr>
-        <w:t>The fourth Obesity submission used an SVM, with public/private Kaggle scores of 0.87789/0.87888.  The SVM result was strongest because margin-based classifiers can work well when a transformed feature space separates classes more cleanly than the raw variables do (Cortes &amp; Vapnik, 1995).</w:t>
+        <w:t>The fourth Obesity submission used an RBF-kernel SVM, with fresh public/private Kaggle scores of 0.87933/0.87879.  This resolves the earlier mismatch between the notebook validation result and the leaderboard because the displayed kernel SVM code is the code that generated the submitted CSV.  The SVM result was strongest because margin-based classifiers can work well when a transformed feature space separates classes more cleanly than the raw variables do (Cortes &amp; Vapnik, 1995).</w:t>
       </w:r>
     </w:p>
     <w:p>
@@ -292,7 +292,7 @@
           <w:b w:val="0"/>
           <w:i w:val="0"/>
         </w:rPr>
-        <w:t>The notebook documents class balance, validation accuracy, balanced accuracy, model-specific assumptions, and the confusion matrix for the best validation model.  The Kaggle section maps each required classifier to its submission file and evidence row.  Because obesity classification is tied to population-level body-mass trends, the predictions should be interpreted as competition labels rather than clinical diagnoses (NCD Risk Factor Collaboration, 2016).  The public repository is `https://github.com/maldo81/dds-8555-predictive-analysis`, and the notebook path is `Week 5/Assignment 5/MaldonadoJDDS8555-5.ipynb`.</w:t>
+        <w:t>The notebook documents class balance, validation accuracy, balanced accuracy, model-specific assumptions, class-conditional numeric skewness, within-class numeric correlations, and the confusion matrix for the best validation model.  The Kaggle section maps each required classifier to its generated submission file and current evidence row.  Because obesity classification is tied to population-level body-mass trends, the predictions should be interpreted as competition labels rather than clinical diagnoses (NCD Risk Factor Collaboration, 2016).  The public repository is `https://github.com/maldo81/dds-8555-predictive-analysis`, and the notebook path is `Week 5/Assignment 5/MaldonadoJDDS8555-5.ipynb`.</w:t>
       </w:r>
     </w:p>
     <w:p>
@@ -305,7 +305,7 @@
           <w:b w:val="0"/>
           <w:i w:val="0"/>
         </w:rPr>
-        <w:t>GitHub/code note: The Python notebook is the code artifact for this assignment and is ready to post with the submission.  The assignment prompt gives one page plus Python notebook as the length guidance, and the notebook carries the detailed output, diagnostics, and submission evidence.</w:t>
+        <w:t>GitHub/code note: The Python notebook is the code artifact for this assignment and is posted with the public submission repository.  The assignment prompt gives one page plus Python notebook as the length guidance, and the notebook carries the detailed output, diagnostics, and submission evidence.</w:t>
       </w:r>
     </w:p>
     <w:p>

</xml_diff>